<commit_message>
test: record release candidate recertification
</commit_message>
<xml_diff>
--- a/validation_lab/deliverables/Veraxis_Campagna_Validazione_Interna.docx
+++ b/validation_lab/deliverables/Veraxis_Campagna_Validazione_Interna.docx
@@ -169,6 +169,9 @@
             </w:r>
           </w:p>
         </w:tc>
+        <w:trPr>
+          <w:tblHeader/>
+        </w:trPr>
       </w:tr>
       <w:tr>
         <w:tc>
@@ -315,6 +318,9 @@
             </w:r>
           </w:p>
         </w:tc>
+        <w:trPr>
+          <w:tblHeader/>
+        </w:trPr>
       </w:tr>
       <w:tr>
         <w:tc>
@@ -890,6 +896,9 @@
             </w:r>
           </w:p>
         </w:tc>
+        <w:trPr>
+          <w:tblHeader/>
+        </w:trPr>
       </w:tr>
       <w:tr>
         <w:tc>
@@ -1161,6 +1170,9 @@
             </w:r>
           </w:p>
         </w:tc>
+        <w:trPr>
+          <w:tblHeader/>
+        </w:trPr>
       </w:tr>
       <w:tr>
         <w:tc>
@@ -1552,6 +1564,9 @@
             </w:r>
           </w:p>
         </w:tc>
+        <w:trPr>
+          <w:tblHeader/>
+        </w:trPr>
       </w:tr>
       <w:tr>
         <w:tc>
@@ -1823,6 +1838,9 @@
             </w:r>
           </w:p>
         </w:tc>
+        <w:trPr>
+          <w:tblHeader/>
+        </w:trPr>
       </w:tr>
       <w:tr>
         <w:tc>
@@ -2198,6 +2216,9 @@
             </w:r>
           </w:p>
         </w:tc>
+        <w:trPr>
+          <w:tblHeader/>
+        </w:trPr>
       </w:tr>
       <w:tr>
         <w:tc>
@@ -2469,6 +2490,9 @@
             </w:r>
           </w:p>
         </w:tc>
+        <w:trPr>
+          <w:tblHeader/>
+        </w:trPr>
       </w:tr>
       <w:tr>
         <w:tc>
@@ -2828,6 +2852,9 @@
             </w:r>
           </w:p>
         </w:tc>
+        <w:trPr>
+          <w:tblHeader/>
+        </w:trPr>
       </w:tr>
       <w:tr>
         <w:tc>
@@ -3099,6 +3126,9 @@
             </w:r>
           </w:p>
         </w:tc>
+        <w:trPr>
+          <w:tblHeader/>
+        </w:trPr>
       </w:tr>
       <w:tr>
         <w:tc>
@@ -3458,6 +3488,9 @@
             </w:r>
           </w:p>
         </w:tc>
+        <w:trPr>
+          <w:tblHeader/>
+        </w:trPr>
       </w:tr>
       <w:tr>
         <w:tc>
@@ -3729,6 +3762,9 @@
             </w:r>
           </w:p>
         </w:tc>
+        <w:trPr>
+          <w:tblHeader/>
+        </w:trPr>
       </w:tr>
       <w:tr>
         <w:tc>
@@ -4304,6 +4340,9 @@
             </w:r>
           </w:p>
         </w:tc>
+        <w:trPr>
+          <w:tblHeader/>
+        </w:trPr>
       </w:tr>
       <w:tr>
         <w:tc>
@@ -4575,6 +4614,9 @@
             </w:r>
           </w:p>
         </w:tc>
+        <w:trPr>
+          <w:tblHeader/>
+        </w:trPr>
       </w:tr>
       <w:tr>
         <w:tc>
@@ -4966,6 +5008,9 @@
             </w:r>
           </w:p>
         </w:tc>
+        <w:trPr>
+          <w:tblHeader/>
+        </w:trPr>
       </w:tr>
       <w:tr>
         <w:tc>
@@ -5237,6 +5282,9 @@
             </w:r>
           </w:p>
         </w:tc>
+        <w:trPr>
+          <w:tblHeader/>
+        </w:trPr>
       </w:tr>
       <w:tr>
         <w:tc>
@@ -5612,6 +5660,9 @@
             </w:r>
           </w:p>
         </w:tc>
+        <w:trPr>
+          <w:tblHeader/>
+        </w:trPr>
       </w:tr>
       <w:tr>
         <w:tc>
@@ -5883,6 +5934,9 @@
             </w:r>
           </w:p>
         </w:tc>
+        <w:trPr>
+          <w:tblHeader/>
+        </w:trPr>
       </w:tr>
       <w:tr>
         <w:tc>
@@ -6242,6 +6296,9 @@
             </w:r>
           </w:p>
         </w:tc>
+        <w:trPr>
+          <w:tblHeader/>
+        </w:trPr>
       </w:tr>
       <w:tr>
         <w:tc>
@@ -6513,6 +6570,9 @@
             </w:r>
           </w:p>
         </w:tc>
+        <w:trPr>
+          <w:tblHeader/>
+        </w:trPr>
       </w:tr>
       <w:tr>
         <w:tc>
@@ -6872,6 +6932,9 @@
             </w:r>
           </w:p>
         </w:tc>
+        <w:trPr>
+          <w:tblHeader/>
+        </w:trPr>
       </w:tr>
       <w:tr>
         <w:tc>
@@ -7143,6 +7206,9 @@
             </w:r>
           </w:p>
         </w:tc>
+        <w:trPr>
+          <w:tblHeader/>
+        </w:trPr>
       </w:tr>
       <w:tr>
         <w:tc>
@@ -7718,6 +7784,9 @@
             </w:r>
           </w:p>
         </w:tc>
+        <w:trPr>
+          <w:tblHeader/>
+        </w:trPr>
       </w:tr>
       <w:tr>
         <w:tc>
@@ -7989,6 +8058,9 @@
             </w:r>
           </w:p>
         </w:tc>
+        <w:trPr>
+          <w:tblHeader/>
+        </w:trPr>
       </w:tr>
       <w:tr>
         <w:tc>
@@ -8380,6 +8452,9 @@
             </w:r>
           </w:p>
         </w:tc>
+        <w:trPr>
+          <w:tblHeader/>
+        </w:trPr>
       </w:tr>
       <w:tr>
         <w:tc>
@@ -8651,6 +8726,9 @@
             </w:r>
           </w:p>
         </w:tc>
+        <w:trPr>
+          <w:tblHeader/>
+        </w:trPr>
       </w:tr>
       <w:tr>
         <w:tc>
@@ -9026,6 +9104,9 @@
             </w:r>
           </w:p>
         </w:tc>
+        <w:trPr>
+          <w:tblHeader/>
+        </w:trPr>
       </w:tr>
       <w:tr>
         <w:tc>
@@ -9297,6 +9378,9 @@
             </w:r>
           </w:p>
         </w:tc>
+        <w:trPr>
+          <w:tblHeader/>
+        </w:trPr>
       </w:tr>
       <w:tr>
         <w:tc>
@@ -9656,6 +9740,9 @@
             </w:r>
           </w:p>
         </w:tc>
+        <w:trPr>
+          <w:tblHeader/>
+        </w:trPr>
       </w:tr>
       <w:tr>
         <w:tc>
@@ -9927,6 +10014,9 @@
             </w:r>
           </w:p>
         </w:tc>
+        <w:trPr>
+          <w:tblHeader/>
+        </w:trPr>
       </w:tr>
       <w:tr>
         <w:tc>
@@ -10286,6 +10376,9 @@
             </w:r>
           </w:p>
         </w:tc>
+        <w:trPr>
+          <w:tblHeader/>
+        </w:trPr>
       </w:tr>
       <w:tr>
         <w:tc>
@@ -10557,6 +10650,9 @@
             </w:r>
           </w:p>
         </w:tc>
+        <w:trPr>
+          <w:tblHeader/>
+        </w:trPr>
       </w:tr>
       <w:tr>
         <w:tc>
@@ -10912,6 +11008,9 @@
             </w:r>
           </w:p>
         </w:tc>
+        <w:trPr>
+          <w:tblHeader/>
+        </w:trPr>
       </w:tr>
       <w:tr>
         <w:tc>
@@ -11183,6 +11282,9 @@
             </w:r>
           </w:p>
         </w:tc>
+        <w:trPr>
+          <w:tblHeader/>
+        </w:trPr>
       </w:tr>
       <w:tr>
         <w:tc>
@@ -11540,6 +11642,9 @@
             </w:r>
           </w:p>
         </w:tc>
+        <w:trPr>
+          <w:tblHeader/>
+        </w:trPr>
       </w:tr>
       <w:tr>
         <w:tc>
@@ -11811,6 +11916,9 @@
             </w:r>
           </w:p>
         </w:tc>
+        <w:trPr>
+          <w:tblHeader/>
+        </w:trPr>
       </w:tr>
       <w:tr>
         <w:tc>
@@ -12384,6 +12492,9 @@
             </w:r>
           </w:p>
         </w:tc>
+        <w:trPr>
+          <w:tblHeader/>
+        </w:trPr>
       </w:tr>
       <w:tr>
         <w:tc>
@@ -12655,6 +12766,9 @@
             </w:r>
           </w:p>
         </w:tc>
+        <w:trPr>
+          <w:tblHeader/>
+        </w:trPr>
       </w:tr>
       <w:tr>
         <w:tc>
@@ -13042,6 +13156,9 @@
             </w:r>
           </w:p>
         </w:tc>
+        <w:trPr>
+          <w:tblHeader/>
+        </w:trPr>
       </w:tr>
       <w:tr>
         <w:tc>
@@ -13313,6 +13430,9 @@
             </w:r>
           </w:p>
         </w:tc>
+        <w:trPr>
+          <w:tblHeader/>
+        </w:trPr>
       </w:tr>
       <w:tr>
         <w:tc>
@@ -13684,6 +13804,9 @@
             </w:r>
           </w:p>
         </w:tc>
+        <w:trPr>
+          <w:tblHeader/>
+        </w:trPr>
       </w:tr>
       <w:tr>
         <w:tc>

</xml_diff>